<commit_message>
Incorporación de mejoras en documento Word para mayor precisión y dinamismo en la generación del finiquito de trabajo
</commit_message>
<xml_diff>
--- a/frontend/public/Formato Renuncia Voluntaria Syf.docx
+++ b/frontend/public/Formato Renuncia Voluntaria Syf.docx
@@ -303,6 +303,7 @@
       <w:r>
         <w:rPr>
           <w:rFonts w:ascii="Calibri" w:hAnsi="Calibri" w:cs="Arial"/>
+          <w:b/>
           <w:bCs/>
           <w:sz w:val="20"/>
           <w:szCs w:val="20"/>
@@ -314,6 +315,7 @@
       <w:r>
         <w:rPr>
           <w:rFonts w:ascii="Calibri" w:hAnsi="Calibri" w:cs="Arial"/>
+          <w:b/>
           <w:bCs/>
           <w:sz w:val="20"/>
           <w:szCs w:val="20"/>
@@ -325,6 +327,7 @@
       <w:r>
         <w:rPr>
           <w:rFonts w:ascii="Calibri" w:hAnsi="Calibri" w:cs="Arial"/>
+          <w:b/>
           <w:bCs/>
           <w:sz w:val="20"/>
           <w:szCs w:val="20"/>
@@ -378,6 +381,7 @@
       <w:r>
         <w:rPr>
           <w:rFonts w:ascii="Calibri" w:hAnsi="Calibri" w:cs="Arial"/>
+          <w:b/>
           <w:sz w:val="20"/>
           <w:szCs w:val="20"/>
           <w:lang w:val="es-CL"/>
@@ -388,6 +392,7 @@
       <w:r>
         <w:rPr>
           <w:rFonts w:ascii="Calibri" w:hAnsi="Calibri" w:cs="Arial"/>
+          <w:b/>
           <w:sz w:val="20"/>
           <w:szCs w:val="20"/>
           <w:lang w:val="es-CL"/>
@@ -398,6 +403,7 @@
       <w:r>
         <w:rPr>
           <w:rFonts w:ascii="Calibri" w:hAnsi="Calibri" w:cs="Arial"/>
+          <w:b/>
           <w:sz w:val="20"/>
           <w:szCs w:val="20"/>
           <w:lang w:val="es-CL"/>
@@ -407,6 +413,7 @@
       <w:r>
         <w:rPr>
           <w:rFonts w:ascii="Calibri" w:hAnsi="Calibri" w:cs="Arial"/>
+          <w:b/>
           <w:sz w:val="20"/>
           <w:szCs w:val="20"/>
           <w:lang w:val="es-CL"/>
@@ -416,6 +423,7 @@
       <w:r>
         <w:rPr>
           <w:rFonts w:ascii="Calibri" w:hAnsi="Calibri" w:cs="Arial"/>
+          <w:b/>
           <w:sz w:val="20"/>
           <w:szCs w:val="20"/>
           <w:lang w:val="es-CL"/>
@@ -558,6 +566,7 @@
       <w:r>
         <w:rPr>
           <w:rFonts w:ascii="Calibri" w:hAnsi="Calibri" w:cs="Arial"/>
+          <w:b/>
           <w:sz w:val="20"/>
           <w:szCs w:val="20"/>
           <w:lang w:val="es-CL"/>
@@ -568,6 +577,7 @@
       <w:r>
         <w:rPr>
           <w:rFonts w:ascii="Calibri" w:hAnsi="Calibri" w:cs="Arial"/>
+          <w:b/>
           <w:sz w:val="20"/>
           <w:szCs w:val="20"/>
           <w:lang w:val="es-CL"/>
@@ -578,6 +588,7 @@
       <w:r>
         <w:rPr>
           <w:rFonts w:ascii="Calibri" w:hAnsi="Calibri" w:cs="Arial"/>
+          <w:b/>
           <w:sz w:val="20"/>
           <w:szCs w:val="20"/>
           <w:lang w:val="es-CL"/>
@@ -596,6 +607,7 @@
       <w:r>
         <w:rPr>
           <w:rFonts w:ascii="Calibri" w:hAnsi="Calibri" w:cs="Arial"/>
+          <w:b/>
           <w:sz w:val="20"/>
           <w:szCs w:val="20"/>
           <w:lang w:val="es-CL"/>
@@ -606,6 +618,7 @@
       <w:r>
         <w:rPr>
           <w:rFonts w:ascii="Calibri" w:hAnsi="Calibri" w:cs="Arial"/>
+          <w:b/>
           <w:sz w:val="20"/>
           <w:szCs w:val="20"/>
           <w:lang w:val="es-CL"/>
@@ -615,18 +628,18 @@
       <w:r>
         <w:rPr>
           <w:rFonts w:ascii="Calibri" w:hAnsi="Calibri" w:cs="Arial"/>
+          <w:b/>
           <w:sz w:val="20"/>
           <w:szCs w:val="20"/>
           <w:lang w:val="es-CL"/>
         </w:rPr>
         <w:t>salida</w:t>
       </w:r>
-      <w:bookmarkStart w:id="0" w:name="_GoBack"/>
-      <w:bookmarkEnd w:id="0"/>
       <w:proofErr w:type="spellEnd"/>
       <w:r>
         <w:rPr>
           <w:rFonts w:ascii="Calibri" w:hAnsi="Calibri" w:cs="Arial"/>
+          <w:b/>
           <w:sz w:val="20"/>
           <w:szCs w:val="20"/>
           <w:lang w:val="es-CL"/>
@@ -640,7 +653,7 @@
           <w:szCs w:val="20"/>
           <w:lang w:val="es-CL"/>
         </w:rPr>
-        <w:t xml:space="preserve">, en que el empleador puso término al contrato de trabajo por la causal legal de </w:t>
+        <w:t xml:space="preserve">, en que el </w:t>
       </w:r>
       <w:r>
         <w:rPr>
@@ -659,11 +672,52 @@
           <w:szCs w:val="20"/>
           <w:lang w:val="es-CL"/>
         </w:rPr>
+        <w:t>sujeto_termino</w:t>
+      </w:r>
+      <w:proofErr w:type="spellEnd"/>
+      <w:r>
+        <w:rPr>
+          <w:rFonts w:ascii="Calibri" w:hAnsi="Calibri" w:cs="Arial"/>
+          <w:sz w:val="20"/>
+          <w:szCs w:val="20"/>
+          <w:lang w:val="es-CL"/>
+        </w:rPr>
+        <w:t>}}</w:t>
+      </w:r>
+      <w:r>
+        <w:rPr>
+          <w:rFonts w:ascii="Calibri" w:hAnsi="Calibri" w:cs="Arial"/>
+          <w:sz w:val="20"/>
+          <w:szCs w:val="20"/>
+          <w:lang w:val="es-CL"/>
+        </w:rPr>
+        <w:t xml:space="preserve"> puso término al contrato de trabajo por la causal legal de </w:t>
+      </w:r>
+      <w:r>
+        <w:rPr>
+          <w:rFonts w:ascii="Calibri" w:hAnsi="Calibri" w:cs="Arial"/>
+          <w:b/>
+          <w:sz w:val="20"/>
+          <w:szCs w:val="20"/>
+          <w:lang w:val="es-CL"/>
+        </w:rPr>
+        <w:t>{{</w:t>
+      </w:r>
+      <w:proofErr w:type="spellStart"/>
+      <w:r>
+        <w:rPr>
+          <w:rFonts w:ascii="Calibri" w:hAnsi="Calibri" w:cs="Arial"/>
+          <w:b/>
+          <w:sz w:val="20"/>
+          <w:szCs w:val="20"/>
+          <w:lang w:val="es-CL"/>
+        </w:rPr>
         <w:t>causal</w:t>
       </w:r>
       <w:r>
         <w:rPr>
           <w:rFonts w:ascii="Calibri" w:hAnsi="Calibri" w:cs="Arial"/>
+          <w:b/>
           <w:sz w:val="20"/>
           <w:szCs w:val="20"/>
           <w:lang w:val="es-CL"/>
@@ -674,6 +728,7 @@
       <w:r>
         <w:rPr>
           <w:rFonts w:ascii="Calibri" w:hAnsi="Calibri" w:cs="Arial"/>
+          <w:b/>
           <w:sz w:val="20"/>
           <w:szCs w:val="20"/>
           <w:lang w:val="es-CL"/>
@@ -715,10 +770,10 @@
         <w:tblLook w:val="04A0" w:firstRow="1" w:lastRow="0" w:firstColumn="1" w:lastColumn="0" w:noHBand="0" w:noVBand="1"/>
       </w:tblPr>
       <w:tblGrid>
-        <w:gridCol w:w="4320"/>
-        <w:gridCol w:w="4000"/>
-        <w:gridCol w:w="320"/>
-        <w:gridCol w:w="4000"/>
+        <w:gridCol w:w="4178"/>
+        <w:gridCol w:w="4142"/>
+        <w:gridCol w:w="394"/>
+        <w:gridCol w:w="3926"/>
         <w:gridCol w:w="4320"/>
       </w:tblGrid>
       <w:tr>
@@ -994,71 +1049,58 @@
       <w:tr>
         <w:trPr>
           <w:gridAfter w:val="2"/>
-          <w:wAfter w:w="8320" w:type="dxa"/>
+          <w:wAfter w:w="8246" w:type="dxa"/>
           <w:trHeight w:val="288"/>
         </w:trPr>
         <w:tc>
           <w:tcPr>
-            <w:tcW w:w="4320" w:type="dxa"/>
+            <w:tcW w:w="4178" w:type="dxa"/>
           </w:tcPr>
           <w:p>
             <w:pPr>
               <w:rPr>
-                <w:rFonts w:ascii="Calibri" w:hAnsi="Calibri" w:cs="Arial"/>
-                <w:sz w:val="20"/>
-                <w:szCs w:val="20"/>
-                <w:lang w:bidi="he-IL"/>
-              </w:rPr>
-            </w:pPr>
-            <w:r>
-              <w:rPr>
                 <w:rFonts w:ascii="Consolas" w:hAnsi="Consolas"/>
+                <w:b/>
                 <w:sz w:val="18"/>
                 <w:szCs w:val="18"/>
               </w:rPr>
-              <w:t>{{#</w:t>
-            </w:r>
-            <w:proofErr w:type="spellStart"/>
+            </w:pPr>
             <w:r>
               <w:rPr>
                 <w:rFonts w:ascii="Consolas" w:hAnsi="Consolas"/>
+                <w:b/>
                 <w:sz w:val="18"/>
                 <w:szCs w:val="18"/>
               </w:rPr>
-              <w:t>haberes_rows</w:t>
-            </w:r>
-            <w:proofErr w:type="spellEnd"/>
+              <w:t>{{</w:t>
+            </w:r>
+            <w:proofErr w:type="spellStart"/>
             <w:r>
               <w:rPr>
                 <w:rFonts w:ascii="Consolas" w:hAnsi="Consolas"/>
+                <w:b/>
                 <w:sz w:val="18"/>
                 <w:szCs w:val="18"/>
               </w:rPr>
-              <w:t>}}{{</w:t>
-            </w:r>
-            <w:proofErr w:type="spellStart"/>
+              <w:t>haberes_title</w:t>
+            </w:r>
+            <w:proofErr w:type="spellEnd"/>
             <w:r>
               <w:rPr>
                 <w:rFonts w:ascii="Consolas" w:hAnsi="Consolas"/>
+                <w:b/>
                 <w:sz w:val="18"/>
                 <w:szCs w:val="18"/>
               </w:rPr>
-              <w:t>concepto</w:t>
-            </w:r>
-            <w:proofErr w:type="spellEnd"/>
-            <w:r>
-              <w:rPr>
-                <w:rFonts w:ascii="Consolas" w:hAnsi="Consolas"/>
-                <w:sz w:val="18"/>
-                <w:szCs w:val="18"/>
-              </w:rPr>
               <w:t>}}</w:t>
             </w:r>
+            <w:bookmarkStart w:id="0" w:name="_GoBack"/>
+            <w:bookmarkEnd w:id="0"/>
           </w:p>
         </w:tc>
         <w:tc>
           <w:tcPr>
-            <w:tcW w:w="4320" w:type="dxa"/>
+            <w:tcW w:w="4536" w:type="dxa"/>
             <w:gridSpan w:val="2"/>
             <w:shd w:val="clear" w:color="auto" w:fill="auto"/>
             <w:noWrap/>
@@ -1067,6 +1109,27 @@
           <w:p>
             <w:pPr>
               <w:rPr>
+                <w:rFonts w:ascii="Consolas" w:hAnsi="Consolas"/>
+                <w:sz w:val="18"/>
+                <w:szCs w:val="18"/>
+              </w:rPr>
+            </w:pPr>
+          </w:p>
+        </w:tc>
+      </w:tr>
+      <w:tr>
+        <w:trPr>
+          <w:gridAfter w:val="2"/>
+          <w:wAfter w:w="8246" w:type="dxa"/>
+          <w:trHeight w:val="288"/>
+        </w:trPr>
+        <w:tc>
+          <w:tcPr>
+            <w:tcW w:w="4178" w:type="dxa"/>
+          </w:tcPr>
+          <w:p>
+            <w:pPr>
+              <w:rPr>
                 <w:rFonts w:ascii="Calibri" w:hAnsi="Calibri" w:cs="Arial"/>
                 <w:sz w:val="20"/>
                 <w:szCs w:val="20"/>
@@ -1079,7 +1142,7 @@
                 <w:sz w:val="18"/>
                 <w:szCs w:val="18"/>
               </w:rPr>
-              <w:t>{{</w:t>
+              <w:t>{{#</w:t>
             </w:r>
             <w:proofErr w:type="spellStart"/>
             <w:r>
@@ -1088,7 +1151,7 @@
                 <w:sz w:val="18"/>
                 <w:szCs w:val="18"/>
               </w:rPr>
-              <w:t>monto</w:t>
+              <w:t>haberes_rows</w:t>
             </w:r>
             <w:proofErr w:type="spellEnd"/>
             <w:r>
@@ -1097,15 +1160,70 @@
                 <w:sz w:val="18"/>
                 <w:szCs w:val="18"/>
               </w:rPr>
-              <w:t>}}</w:t>
-            </w:r>
+              <w:t>}}{{</w:t>
+            </w:r>
+            <w:proofErr w:type="spellStart"/>
             <w:r>
               <w:rPr>
                 <w:rFonts w:ascii="Consolas" w:hAnsi="Consolas"/>
                 <w:sz w:val="18"/>
                 <w:szCs w:val="18"/>
               </w:rPr>
-              <w:t>{{/</w:t>
+              <w:t>concepto</w:t>
+            </w:r>
+            <w:proofErr w:type="spellEnd"/>
+            <w:r>
+              <w:rPr>
+                <w:rFonts w:ascii="Consolas" w:hAnsi="Consolas"/>
+                <w:sz w:val="18"/>
+                <w:szCs w:val="18"/>
+              </w:rPr>
+              <w:t>}}</w:t>
+            </w:r>
+          </w:p>
+        </w:tc>
+        <w:tc>
+          <w:tcPr>
+            <w:tcW w:w="4536" w:type="dxa"/>
+            <w:gridSpan w:val="2"/>
+            <w:shd w:val="clear" w:color="auto" w:fill="auto"/>
+            <w:noWrap/>
+            <w:vAlign w:val="bottom"/>
+          </w:tcPr>
+          <w:p>
+            <w:pPr>
+              <w:rPr>
+                <w:rFonts w:ascii="Calibri" w:hAnsi="Calibri" w:cs="Arial"/>
+                <w:sz w:val="20"/>
+                <w:szCs w:val="20"/>
+                <w:lang w:bidi="he-IL"/>
+              </w:rPr>
+            </w:pPr>
+            <w:r>
+              <w:rPr>
+                <w:rFonts w:ascii="Consolas" w:hAnsi="Consolas"/>
+                <w:sz w:val="18"/>
+                <w:szCs w:val="18"/>
+              </w:rPr>
+              <w:t>{{</w:t>
+            </w:r>
+            <w:proofErr w:type="spellStart"/>
+            <w:r>
+              <w:rPr>
+                <w:rFonts w:ascii="Consolas" w:hAnsi="Consolas"/>
+                <w:sz w:val="18"/>
+                <w:szCs w:val="18"/>
+              </w:rPr>
+              <w:t>monto</w:t>
+            </w:r>
+            <w:proofErr w:type="spellEnd"/>
+            <w:r>
+              <w:rPr>
+                <w:rFonts w:ascii="Consolas" w:hAnsi="Consolas"/>
+                <w:sz w:val="18"/>
+                <w:szCs w:val="18"/>
+              </w:rPr>
+              <w:t>}}{{/</w:t>
             </w:r>
             <w:proofErr w:type="spellStart"/>
             <w:r>
@@ -1135,17 +1253,311 @@
         <w:jc w:val="left"/>
         <w:rPr>
           <w:rFonts w:ascii="Calibri" w:hAnsi="Calibri" w:cs="Arial"/>
-          <w:sz w:val="20"/>
-          <w:szCs w:val="20"/>
-        </w:rPr>
-      </w:pPr>
-    </w:p>
+          <w:b/>
+          <w:sz w:val="20"/>
+          <w:szCs w:val="20"/>
+        </w:rPr>
+      </w:pPr>
+    </w:p>
+    <w:tbl>
+      <w:tblPr>
+        <w:tblW w:w="8714" w:type="dxa"/>
+        <w:tblInd w:w="70" w:type="dxa"/>
+        <w:tblCellMar>
+          <w:left w:w="70" w:type="dxa"/>
+          <w:right w:w="70" w:type="dxa"/>
+        </w:tblCellMar>
+        <w:tblLook w:val="04A0" w:firstRow="1" w:lastRow="0" w:firstColumn="1" w:lastColumn="0" w:noHBand="0" w:noVBand="1"/>
+      </w:tblPr>
+      <w:tblGrid>
+        <w:gridCol w:w="4178"/>
+        <w:gridCol w:w="4536"/>
+      </w:tblGrid>
+      <w:tr>
+        <w:trPr>
+          <w:trHeight w:val="288"/>
+        </w:trPr>
+        <w:tc>
+          <w:tcPr>
+            <w:tcW w:w="4178" w:type="dxa"/>
+          </w:tcPr>
+          <w:p>
+            <w:pPr>
+              <w:rPr>
+                <w:rFonts w:ascii="Consolas" w:hAnsi="Consolas"/>
+                <w:b/>
+                <w:sz w:val="18"/>
+                <w:szCs w:val="18"/>
+              </w:rPr>
+            </w:pPr>
+            <w:r>
+              <w:rPr>
+                <w:rFonts w:ascii="Consolas" w:hAnsi="Consolas"/>
+                <w:b/>
+                <w:sz w:val="18"/>
+                <w:szCs w:val="18"/>
+              </w:rPr>
+              <w:t>{{</w:t>
+            </w:r>
+            <w:proofErr w:type="spellStart"/>
+            <w:r>
+              <w:rPr>
+                <w:rFonts w:ascii="Consolas" w:hAnsi="Consolas"/>
+                <w:b/>
+                <w:sz w:val="18"/>
+                <w:szCs w:val="18"/>
+              </w:rPr>
+              <w:t>descuentos_title</w:t>
+            </w:r>
+            <w:proofErr w:type="spellEnd"/>
+            <w:r>
+              <w:rPr>
+                <w:rFonts w:ascii="Consolas" w:hAnsi="Consolas"/>
+                <w:b/>
+                <w:sz w:val="18"/>
+                <w:szCs w:val="18"/>
+              </w:rPr>
+              <w:t>}}</w:t>
+            </w:r>
+          </w:p>
+        </w:tc>
+        <w:tc>
+          <w:tcPr>
+            <w:tcW w:w="4536" w:type="dxa"/>
+            <w:shd w:val="clear" w:color="auto" w:fill="auto"/>
+            <w:noWrap/>
+            <w:vAlign w:val="bottom"/>
+          </w:tcPr>
+          <w:p>
+            <w:pPr>
+              <w:rPr>
+                <w:rFonts w:ascii="Consolas" w:hAnsi="Consolas"/>
+                <w:sz w:val="18"/>
+                <w:szCs w:val="18"/>
+              </w:rPr>
+            </w:pPr>
+          </w:p>
+        </w:tc>
+      </w:tr>
+      <w:tr>
+        <w:trPr>
+          <w:trHeight w:val="288"/>
+        </w:trPr>
+        <w:tc>
+          <w:tcPr>
+            <w:tcW w:w="4178" w:type="dxa"/>
+          </w:tcPr>
+          <w:p>
+            <w:pPr>
+              <w:rPr>
+                <w:rFonts w:ascii="Calibri" w:hAnsi="Calibri" w:cs="Arial"/>
+                <w:sz w:val="20"/>
+                <w:szCs w:val="20"/>
+                <w:lang w:bidi="he-IL"/>
+              </w:rPr>
+            </w:pPr>
+            <w:r>
+              <w:rPr>
+                <w:rFonts w:ascii="Consolas" w:hAnsi="Consolas"/>
+                <w:sz w:val="18"/>
+                <w:szCs w:val="18"/>
+              </w:rPr>
+              <w:t>{{#</w:t>
+            </w:r>
+            <w:proofErr w:type="spellStart"/>
+            <w:r>
+              <w:rPr>
+                <w:rFonts w:ascii="Consolas" w:hAnsi="Consolas"/>
+                <w:sz w:val="18"/>
+                <w:szCs w:val="18"/>
+              </w:rPr>
+              <w:t>descuentos_rows</w:t>
+            </w:r>
+            <w:proofErr w:type="spellEnd"/>
+            <w:r>
+              <w:rPr>
+                <w:rFonts w:ascii="Consolas" w:hAnsi="Consolas"/>
+                <w:sz w:val="18"/>
+                <w:szCs w:val="18"/>
+              </w:rPr>
+              <w:t>}}{{</w:t>
+            </w:r>
+            <w:proofErr w:type="spellStart"/>
+            <w:r>
+              <w:rPr>
+                <w:rFonts w:ascii="Consolas" w:hAnsi="Consolas"/>
+                <w:sz w:val="18"/>
+                <w:szCs w:val="18"/>
+              </w:rPr>
+              <w:t>concepto</w:t>
+            </w:r>
+            <w:proofErr w:type="spellEnd"/>
+            <w:r>
+              <w:rPr>
+                <w:rFonts w:ascii="Consolas" w:hAnsi="Consolas"/>
+                <w:sz w:val="18"/>
+                <w:szCs w:val="18"/>
+              </w:rPr>
+              <w:t>}}</w:t>
+            </w:r>
+          </w:p>
+        </w:tc>
+        <w:tc>
+          <w:tcPr>
+            <w:tcW w:w="4536" w:type="dxa"/>
+            <w:shd w:val="clear" w:color="auto" w:fill="auto"/>
+            <w:noWrap/>
+            <w:vAlign w:val="bottom"/>
+          </w:tcPr>
+          <w:p>
+            <w:pPr>
+              <w:rPr>
+                <w:rFonts w:ascii="Calibri" w:hAnsi="Calibri" w:cs="Arial"/>
+                <w:sz w:val="20"/>
+                <w:szCs w:val="20"/>
+                <w:lang w:bidi="he-IL"/>
+              </w:rPr>
+            </w:pPr>
+            <w:r>
+              <w:rPr>
+                <w:rFonts w:ascii="Consolas" w:hAnsi="Consolas"/>
+                <w:sz w:val="18"/>
+                <w:szCs w:val="18"/>
+              </w:rPr>
+              <w:t>{{</w:t>
+            </w:r>
+            <w:proofErr w:type="spellStart"/>
+            <w:r>
+              <w:rPr>
+                <w:rFonts w:ascii="Consolas" w:hAnsi="Consolas"/>
+                <w:sz w:val="18"/>
+                <w:szCs w:val="18"/>
+              </w:rPr>
+              <w:t>monto</w:t>
+            </w:r>
+            <w:proofErr w:type="spellEnd"/>
+            <w:r>
+              <w:rPr>
+                <w:rFonts w:ascii="Consolas" w:hAnsi="Consolas"/>
+                <w:sz w:val="18"/>
+                <w:szCs w:val="18"/>
+              </w:rPr>
+              <w:t>}}{{/</w:t>
+            </w:r>
+            <w:proofErr w:type="spellStart"/>
+            <w:r>
+              <w:rPr>
+                <w:rFonts w:ascii="Consolas" w:hAnsi="Consolas"/>
+                <w:sz w:val="18"/>
+                <w:szCs w:val="18"/>
+              </w:rPr>
+              <w:t>descuentos_rows</w:t>
+            </w:r>
+            <w:proofErr w:type="spellEnd"/>
+            <w:r>
+              <w:rPr>
+                <w:rFonts w:ascii="Consolas" w:hAnsi="Consolas"/>
+                <w:sz w:val="18"/>
+                <w:szCs w:val="18"/>
+              </w:rPr>
+              <w:t>}}</w:t>
+            </w:r>
+          </w:p>
+        </w:tc>
+      </w:tr>
+      <w:tr>
+        <w:trPr>
+          <w:trHeight w:val="288"/>
+        </w:trPr>
+        <w:tc>
+          <w:tcPr>
+            <w:tcW w:w="4178" w:type="dxa"/>
+          </w:tcPr>
+          <w:p>
+            <w:pPr>
+              <w:rPr>
+                <w:rFonts w:ascii="Consolas" w:hAnsi="Consolas"/>
+                <w:sz w:val="18"/>
+                <w:szCs w:val="18"/>
+              </w:rPr>
+            </w:pPr>
+            <w:r>
+              <w:rPr>
+                <w:rFonts w:ascii="Consolas" w:hAnsi="Consolas"/>
+                <w:sz w:val="18"/>
+                <w:szCs w:val="18"/>
+              </w:rPr>
+              <w:t>TOTAL A PAGAR:</w:t>
+            </w:r>
+          </w:p>
+        </w:tc>
+        <w:tc>
+          <w:tcPr>
+            <w:tcW w:w="4536" w:type="dxa"/>
+            <w:shd w:val="clear" w:color="auto" w:fill="auto"/>
+            <w:noWrap/>
+            <w:vAlign w:val="bottom"/>
+          </w:tcPr>
+          <w:p>
+            <w:pPr>
+              <w:rPr>
+                <w:rFonts w:ascii="Consolas" w:hAnsi="Consolas"/>
+                <w:b/>
+                <w:sz w:val="18"/>
+                <w:szCs w:val="18"/>
+              </w:rPr>
+            </w:pPr>
+            <w:r>
+              <w:rPr>
+                <w:rFonts w:ascii="Consolas" w:hAnsi="Consolas"/>
+                <w:b/>
+                <w:sz w:val="18"/>
+                <w:szCs w:val="18"/>
+              </w:rPr>
+              <w:t>{{</w:t>
+            </w:r>
+            <w:proofErr w:type="spellStart"/>
+            <w:r>
+              <w:rPr>
+                <w:rFonts w:ascii="Consolas" w:hAnsi="Consolas"/>
+                <w:b/>
+                <w:sz w:val="18"/>
+                <w:szCs w:val="18"/>
+              </w:rPr>
+              <w:t>total_a_pagar_tabla</w:t>
+            </w:r>
+            <w:proofErr w:type="spellEnd"/>
+            <w:r>
+              <w:rPr>
+                <w:rFonts w:ascii="Consolas" w:hAnsi="Consolas"/>
+                <w:b/>
+                <w:sz w:val="18"/>
+                <w:szCs w:val="18"/>
+              </w:rPr>
+              <w:t>}}</w:t>
+            </w:r>
+          </w:p>
+        </w:tc>
+      </w:tr>
+    </w:tbl>
     <w:p>
       <w:pPr>
         <w:pStyle w:val="Textoindependiente"/>
         <w:jc w:val="left"/>
         <w:rPr>
           <w:rFonts w:ascii="Calibri" w:hAnsi="Calibri" w:cs="Arial"/>
+          <w:b/>
+          <w:sz w:val="20"/>
+          <w:szCs w:val="20"/>
+          <w:u w:val="single"/>
+        </w:rPr>
+      </w:pPr>
+    </w:p>
+    <w:p>
+      <w:pPr>
+        <w:pStyle w:val="Textoindependiente"/>
+        <w:rPr>
+          <w:rFonts w:ascii="Calibri" w:hAnsi="Calibri" w:cs="Arial"/>
           <w:sz w:val="20"/>
           <w:szCs w:val="20"/>
         </w:rPr>
@@ -1161,6 +1573,7 @@
       <w:r>
         <w:rPr>
           <w:rFonts w:ascii="Calibri" w:hAnsi="Calibri" w:cs="Arial"/>
+          <w:b/>
           <w:sz w:val="20"/>
           <w:szCs w:val="20"/>
         </w:rPr>
@@ -1170,6 +1583,7 @@
       <w:r>
         <w:rPr>
           <w:rFonts w:ascii="Calibri" w:hAnsi="Calibri" w:cs="Arial"/>
+          <w:b/>
           <w:sz w:val="20"/>
           <w:szCs w:val="20"/>
         </w:rPr>
@@ -1179,6 +1593,7 @@
       <w:r>
         <w:rPr>
           <w:rFonts w:ascii="Calibri" w:hAnsi="Calibri" w:cs="Arial"/>
+          <w:b/>
           <w:sz w:val="20"/>
           <w:szCs w:val="20"/>
         </w:rPr>
@@ -1235,7 +1650,6 @@
     <w:p>
       <w:pPr>
         <w:pStyle w:val="Textoindependiente"/>
-        <w:jc w:val="left"/>
         <w:rPr>
           <w:rFonts w:ascii="Calibri" w:hAnsi="Calibri" w:cs="Arial"/>
           <w:b/>
@@ -1247,32 +1661,132 @@
     <w:p>
       <w:pPr>
         <w:pStyle w:val="Textoindependiente"/>
-        <w:jc w:val="left"/>
-        <w:rPr>
-          <w:rFonts w:ascii="Calibri" w:hAnsi="Calibri" w:cs="Arial"/>
-          <w:b/>
-          <w:sz w:val="20"/>
-          <w:szCs w:val="20"/>
-        </w:rPr>
-      </w:pPr>
+        <w:rPr>
+          <w:rFonts w:ascii="Calibri" w:hAnsi="Calibri" w:cs="Arial"/>
+          <w:sz w:val="20"/>
+          <w:szCs w:val="20"/>
+        </w:rPr>
+      </w:pPr>
+      <w:r>
+        <w:rPr>
+          <w:rFonts w:ascii="Calibri" w:hAnsi="Calibri" w:cs="Arial"/>
+          <w:b/>
+          <w:sz w:val="20"/>
+          <w:szCs w:val="20"/>
+        </w:rPr>
+        <w:t>TERCERO:</w:t>
+      </w:r>
+      <w:r>
+        <w:rPr>
+          <w:rFonts w:ascii="Calibri" w:hAnsi="Calibri" w:cs="Arial"/>
+          <w:sz w:val="20"/>
+          <w:szCs w:val="20"/>
+        </w:rPr>
+        <w:t xml:space="preserve"> Al firmar el presente documento, y en mérito de lo expuesto precedentemente </w:t>
+      </w:r>
+      <w:r>
+        <w:rPr>
+          <w:rFonts w:ascii="Calibri" w:hAnsi="Calibri" w:cs="Arial"/>
+          <w:sz w:val="20"/>
+          <w:szCs w:val="20"/>
+        </w:rPr>
+        <w:t>don</w:t>
+      </w:r>
+      <w:r>
+        <w:rPr>
+          <w:rFonts w:ascii="Calibri" w:hAnsi="Calibri" w:cs="Arial"/>
+          <w:sz w:val="20"/>
+          <w:szCs w:val="20"/>
+        </w:rPr>
+        <w:t>(ña)</w:t>
+      </w:r>
+      <w:r>
+        <w:rPr>
+          <w:rFonts w:ascii="Calibri" w:hAnsi="Calibri" w:cs="Arial"/>
+          <w:sz w:val="20"/>
+          <w:szCs w:val="20"/>
+        </w:rPr>
+        <w:t xml:space="preserve"> </w:t>
+      </w:r>
+      <w:r>
+        <w:rPr>
+          <w:rFonts w:ascii="Calibri" w:hAnsi="Calibri" w:cs="Arial"/>
+          <w:b/>
+          <w:sz w:val="20"/>
+          <w:szCs w:val="20"/>
+        </w:rPr>
+        <w:t>{{</w:t>
+      </w:r>
+      <w:proofErr w:type="spellStart"/>
+      <w:r>
+        <w:rPr>
+          <w:rFonts w:ascii="Calibri" w:hAnsi="Calibri" w:cs="Arial"/>
+          <w:b/>
+          <w:sz w:val="20"/>
+          <w:szCs w:val="20"/>
+        </w:rPr>
+        <w:t>nombre_trabajador</w:t>
+      </w:r>
+      <w:proofErr w:type="spellEnd"/>
+      <w:r>
+        <w:rPr>
+          <w:rFonts w:ascii="Calibri" w:hAnsi="Calibri" w:cs="Arial"/>
+          <w:b/>
+          <w:sz w:val="20"/>
+          <w:szCs w:val="20"/>
+        </w:rPr>
+        <w:t>}}</w:t>
+      </w:r>
+      <w:r>
+        <w:rPr>
+          <w:rFonts w:ascii="Calibri" w:hAnsi="Calibri" w:cs="Arial"/>
+          <w:sz w:val="20"/>
+          <w:szCs w:val="20"/>
+        </w:rPr>
+        <w:t xml:space="preserve"> declara que no tiene cargo alguno que formular en contra de </w:t>
+      </w:r>
+      <w:r>
+        <w:rPr>
+          <w:rFonts w:ascii="Calibri" w:hAnsi="Calibri" w:cs="Arial"/>
+          <w:b/>
+          <w:sz w:val="20"/>
+          <w:szCs w:val="20"/>
+          <w:lang w:val="es-ES_tradnl"/>
+        </w:rPr>
+        <w:t>{{empresa}}</w:t>
+      </w:r>
+      <w:r>
+        <w:rPr>
+          <w:rFonts w:ascii="Calibri" w:hAnsi="Calibri" w:cs="Arial"/>
+          <w:sz w:val="20"/>
+          <w:szCs w:val="20"/>
+        </w:rPr>
+        <w:t xml:space="preserve"> por ningún concepto derivado de la relación laboral o de su terminación, tales como, remuneraciones, sueldos, bonos, sobresueldos, imposiciones, feriados, bonificaciones, gratificaciones, nivelaciones, asignaciones, indemnizaciones por años de servicio </w:t>
+      </w:r>
     </w:p>
     <w:p>
       <w:pPr>
         <w:pStyle w:val="Textoindependiente"/>
         <w:rPr>
           <w:rFonts w:ascii="Calibri" w:hAnsi="Calibri" w:cs="Arial"/>
-          <w:b/>
-          <w:sz w:val="20"/>
-          <w:szCs w:val="20"/>
-        </w:rPr>
-      </w:pPr>
+          <w:sz w:val="20"/>
+          <w:szCs w:val="20"/>
+        </w:rPr>
+      </w:pPr>
+      <w:r>
+        <w:rPr>
+          <w:rFonts w:ascii="Calibri" w:hAnsi="Calibri" w:cs="Arial"/>
+          <w:sz w:val="20"/>
+          <w:szCs w:val="20"/>
+        </w:rPr>
+        <w:t xml:space="preserve">indemnizaciones por término de contrato, indemnizaciones por daño emergente, lucro cesante o daño moral, indemnizaciones por accidente del trabajo o enfermedad profesional, aguinaldos de Navidad y Fiestas Patrias, u otros de igual o distinta naturaleza, herramientas de trabajo, vacaciones, ni por ningún o derecho, beneficio, prestación o regalía legal, voluntaria o convencional, que tenga o tuviere de la Empresa. </w:t>
+      </w:r>
     </w:p>
     <w:p>
       <w:pPr>
         <w:pStyle w:val="Textoindependiente"/>
         <w:rPr>
           <w:rFonts w:ascii="Calibri" w:hAnsi="Calibri" w:cs="Arial"/>
-          <w:b/>
           <w:sz w:val="20"/>
           <w:szCs w:val="20"/>
         </w:rPr>
@@ -1283,173 +1797,26 @@
         <w:pStyle w:val="Textoindependiente"/>
         <w:rPr>
           <w:rFonts w:ascii="Calibri" w:hAnsi="Calibri" w:cs="Arial"/>
-          <w:b/>
-          <w:sz w:val="20"/>
-          <w:szCs w:val="20"/>
-        </w:rPr>
-      </w:pPr>
-    </w:p>
-    <w:p>
-      <w:pPr>
-        <w:pStyle w:val="Textoindependiente"/>
-        <w:rPr>
-          <w:rFonts w:ascii="Calibri" w:hAnsi="Calibri" w:cs="Arial"/>
-          <w:b/>
-          <w:sz w:val="20"/>
-          <w:szCs w:val="20"/>
-        </w:rPr>
-      </w:pPr>
-    </w:p>
-    <w:p>
-      <w:pPr>
-        <w:pStyle w:val="Textoindependiente"/>
-        <w:rPr>
-          <w:rFonts w:ascii="Calibri" w:hAnsi="Calibri" w:cs="Arial"/>
-          <w:sz w:val="20"/>
-          <w:szCs w:val="20"/>
-        </w:rPr>
-      </w:pPr>
-      <w:r>
-        <w:rPr>
-          <w:rFonts w:ascii="Calibri" w:hAnsi="Calibri" w:cs="Arial"/>
-          <w:b/>
-          <w:sz w:val="20"/>
-          <w:szCs w:val="20"/>
-        </w:rPr>
-        <w:t>TERCERO:</w:t>
-      </w:r>
-      <w:r>
-        <w:rPr>
-          <w:rFonts w:ascii="Calibri" w:hAnsi="Calibri" w:cs="Arial"/>
-          <w:sz w:val="20"/>
-          <w:szCs w:val="20"/>
-        </w:rPr>
-        <w:t xml:space="preserve"> Al firmar el presente documento, y en mérito de lo expuesto precedentemente </w:t>
-      </w:r>
-      <w:r>
-        <w:rPr>
-          <w:rFonts w:ascii="Calibri" w:hAnsi="Calibri" w:cs="Arial"/>
-          <w:sz w:val="20"/>
-          <w:szCs w:val="20"/>
-        </w:rPr>
-        <w:t>don</w:t>
-      </w:r>
-      <w:r>
-        <w:rPr>
-          <w:rFonts w:ascii="Calibri" w:hAnsi="Calibri" w:cs="Arial"/>
-          <w:sz w:val="20"/>
-          <w:szCs w:val="20"/>
-        </w:rPr>
-        <w:t>(ña)</w:t>
-      </w:r>
-      <w:r>
-        <w:rPr>
-          <w:rFonts w:ascii="Calibri" w:hAnsi="Calibri" w:cs="Arial"/>
-          <w:sz w:val="20"/>
-          <w:szCs w:val="20"/>
-        </w:rPr>
-        <w:t xml:space="preserve"> </w:t>
-      </w:r>
-      <w:r>
-        <w:rPr>
-          <w:rFonts w:ascii="Calibri" w:hAnsi="Calibri" w:cs="Arial"/>
-          <w:b/>
-          <w:sz w:val="20"/>
-          <w:szCs w:val="20"/>
-        </w:rPr>
-        <w:t>{{</w:t>
-      </w:r>
-      <w:proofErr w:type="spellStart"/>
-      <w:r>
-        <w:rPr>
-          <w:rFonts w:ascii="Calibri" w:hAnsi="Calibri" w:cs="Arial"/>
-          <w:b/>
-          <w:sz w:val="20"/>
-          <w:szCs w:val="20"/>
-        </w:rPr>
-        <w:t>nombre_trabajador</w:t>
-      </w:r>
-      <w:proofErr w:type="spellEnd"/>
-      <w:r>
-        <w:rPr>
-          <w:rFonts w:ascii="Calibri" w:hAnsi="Calibri" w:cs="Arial"/>
-          <w:b/>
-          <w:sz w:val="20"/>
-          <w:szCs w:val="20"/>
-        </w:rPr>
-        <w:t>}}</w:t>
-      </w:r>
-      <w:r>
-        <w:rPr>
-          <w:rFonts w:ascii="Calibri" w:hAnsi="Calibri" w:cs="Arial"/>
-          <w:sz w:val="20"/>
-          <w:szCs w:val="20"/>
-        </w:rPr>
-        <w:t xml:space="preserve"> declara que no tiene cargo alguno que formular en contra de </w:t>
-      </w:r>
-      <w:r>
-        <w:rPr>
-          <w:rFonts w:ascii="Calibri" w:hAnsi="Calibri" w:cs="Arial"/>
-          <w:b/>
-          <w:sz w:val="20"/>
-          <w:szCs w:val="20"/>
-          <w:lang w:val="es-ES_tradnl"/>
-        </w:rPr>
-        <w:t>{{empresa}}</w:t>
-      </w:r>
-      <w:r>
-        <w:rPr>
-          <w:rFonts w:ascii="Calibri" w:hAnsi="Calibri" w:cs="Arial"/>
-          <w:sz w:val="20"/>
-          <w:szCs w:val="20"/>
-        </w:rPr>
-        <w:t xml:space="preserve"> por ningún concepto derivado de la relación laboral o de su terminación, tales como, remuneraciones, sueldos, bonos, sobresueldos, imposiciones, feriados, bonificaciones, gratificaciones, nivelaciones, asignaciones, indemnizaciones por años de servicio </w:t>
-      </w:r>
-    </w:p>
-    <w:p>
-      <w:pPr>
-        <w:pStyle w:val="Textoindependiente"/>
-        <w:rPr>
-          <w:rFonts w:ascii="Calibri" w:hAnsi="Calibri" w:cs="Arial"/>
-          <w:sz w:val="20"/>
-          <w:szCs w:val="20"/>
-        </w:rPr>
-      </w:pPr>
-      <w:r>
-        <w:rPr>
-          <w:rFonts w:ascii="Calibri" w:hAnsi="Calibri" w:cs="Arial"/>
-          <w:sz w:val="20"/>
-          <w:szCs w:val="20"/>
-        </w:rPr>
-        <w:t xml:space="preserve">indemnizaciones por término de contrato, indemnizaciones por daño emergente, lucro cesante o daño moral, indemnizaciones por accidente del trabajo o enfermedad profesional, aguinaldos de Navidad y Fiestas Patrias, u otros de igual o distinta naturaleza, herramientas de trabajo, vacaciones, ni por ningún o derecho, beneficio, prestación o regalía legal, voluntaria o convencional, que tenga o tuviere de la Empresa. </w:t>
-      </w:r>
-    </w:p>
-    <w:p>
-      <w:pPr>
-        <w:pStyle w:val="Textoindependiente"/>
-        <w:rPr>
-          <w:rFonts w:ascii="Calibri" w:hAnsi="Calibri" w:cs="Arial"/>
-          <w:sz w:val="20"/>
-          <w:szCs w:val="20"/>
-        </w:rPr>
-      </w:pPr>
-    </w:p>
-    <w:p>
-      <w:pPr>
-        <w:pStyle w:val="Textoindependiente"/>
-        <w:rPr>
-          <w:rFonts w:ascii="Calibri" w:hAnsi="Calibri" w:cs="Arial"/>
-          <w:sz w:val="20"/>
-          <w:szCs w:val="20"/>
-        </w:rPr>
-      </w:pPr>
-      <w:r>
-        <w:rPr>
-          <w:rFonts w:ascii="Calibri" w:hAnsi="Calibri" w:cs="Arial"/>
-          <w:sz w:val="20"/>
-          <w:szCs w:val="20"/>
-        </w:rPr>
-        <w:t>Por lo tanto, el ex trabajador da por cumplida, pagada y debidamente enterada y al día toda obligación, prestación, remuneración o indemnización derivada de la relación laboral, ya sean éstas cotizaciones de salud o de previsión social, incluso aquellas que han sido o son materia de controversia, reclamo o juicio terminado o pendiente.</w:t>
+          <w:sz w:val="20"/>
+          <w:szCs w:val="20"/>
+        </w:rPr>
+      </w:pPr>
+      <w:r>
+        <w:rPr>
+          <w:rFonts w:ascii="Calibri" w:hAnsi="Calibri" w:cs="Arial"/>
+          <w:sz w:val="20"/>
+          <w:szCs w:val="20"/>
+        </w:rPr>
+        <w:t xml:space="preserve">Por lo tanto, el ex trabajador da por cumplida, pagada y debidamente enterada y al día toda obligación, prestación, remuneración o indemnización derivada de la relación laboral, ya sean éstas cotizaciones de salud </w:t>
+      </w:r>
+      <w:r>
+        <w:rPr>
+          <w:rFonts w:ascii="Calibri" w:hAnsi="Calibri" w:cs="Arial"/>
+          <w:sz w:val="20"/>
+          <w:szCs w:val="20"/>
+        </w:rPr>
+        <w:lastRenderedPageBreak/>
+        <w:t>o de previsión social, incluso aquellas que han sido o son materia de controversia, reclamo o juicio terminado o pendiente.</w:t>
       </w:r>
     </w:p>
     <w:p>
@@ -1480,7 +1847,6 @@
           <w:sz w:val="20"/>
           <w:szCs w:val="20"/>
         </w:rPr>
-        <w:lastRenderedPageBreak/>
         <w:t xml:space="preserve">El ex-trabajador acepta la causal de terminación del contrato de trabajo antes señalada, dejando constancia que la Empresa respecto de su exoneración y las circunstancias que la rodearon, ha tenido una conducta conforme a derecho y que no ha cometido infracción legal, contractual o negligencia alguna que le pudiere causar daño o perjuicio. En consecuencia, el ex-trabajador le otorga a ésta el más amplio y completo finiquito por la relación laboral que existió entre él y la Empresa como también respecto de la terminación del contrato de trabajo. </w:t>
       </w:r>
     </w:p>
@@ -2262,7 +2628,7 @@
                   <a:blip r:embed="rId1">
                     <a:extLst>
                       <a:ext uri="{96DAC541-7B7A-43D3-8B79-37D633B846F1}">
-                        <asvg:svgBlip xmlns:asvg="http://schemas.microsoft.com/office/drawing/2016/SVG/main" xmlns:w16sdtdh="http://schemas.microsoft.com/office/word/2020/wordml/sdtdatahash" xmlns:w16="http://schemas.microsoft.com/office/word/2018/wordml" xmlns:w16cid="http://schemas.microsoft.com/office/word/2016/wordml/cid" xmlns:w16cex="http://schemas.microsoft.com/office/word/2018/wordml/cex" xmlns:w="http://schemas.openxmlformats.org/wordprocessingml/2006/main" xmlns:w10="urn:schemas-microsoft-com:office:word" xmlns:v="urn:schemas-microsoft-com:vml" xmlns:oel="http://schemas.microsoft.com/office/2019/extlst" xmlns:o="urn:schemas-microsoft-com:office:office" xmlns:am3d="http://schemas.microsoft.com/office/drawing/2017/model3d" xmlns:aink="http://schemas.microsoft.com/office/drawing/2016/ink" xmlns:cx8="http://schemas.microsoft.com/office/drawing/2016/5/14/chartex" xmlns:cx7="http://schemas.microsoft.com/office/drawing/2016/5/13/chartex" xmlns:cx6="http://schemas.microsoft.com/office/drawing/2016/5/12/chartex" xmlns:cx5="http://schemas.microsoft.com/office/drawing/2016/5/11/chartex" xmlns:cx4="http://schemas.microsoft.com/office/drawing/2016/5/10/chartex" xmlns:cx3="http://schemas.microsoft.com/office/drawing/2016/5/9/chartex" xmlns:cx2="http://schemas.microsoft.com/office/drawing/2015/10/21/chartex" xmlns="" r:embed="rId7"/>
+                        <asvg:svgBlip xmlns="" xmlns:cx2="http://schemas.microsoft.com/office/drawing/2015/10/21/chartex" xmlns:cx3="http://schemas.microsoft.com/office/drawing/2016/5/9/chartex" xmlns:cx4="http://schemas.microsoft.com/office/drawing/2016/5/10/chartex" xmlns:cx5="http://schemas.microsoft.com/office/drawing/2016/5/11/chartex" xmlns:cx6="http://schemas.microsoft.com/office/drawing/2016/5/12/chartex" xmlns:cx7="http://schemas.microsoft.com/office/drawing/2016/5/13/chartex" xmlns:cx8="http://schemas.microsoft.com/office/drawing/2016/5/14/chartex" xmlns:aink="http://schemas.microsoft.com/office/drawing/2016/ink" xmlns:am3d="http://schemas.microsoft.com/office/drawing/2017/model3d" xmlns:o="urn:schemas-microsoft-com:office:office" xmlns:oel="http://schemas.microsoft.com/office/2019/extlst" xmlns:v="urn:schemas-microsoft-com:vml" xmlns:w10="urn:schemas-microsoft-com:office:word" xmlns:w="http://schemas.openxmlformats.org/wordprocessingml/2006/main" xmlns:w16cex="http://schemas.microsoft.com/office/word/2018/wordml/cex" xmlns:w16cid="http://schemas.microsoft.com/office/word/2016/wordml/cid" xmlns:w16="http://schemas.microsoft.com/office/word/2018/wordml" xmlns:w16sdtdh="http://schemas.microsoft.com/office/word/2020/wordml/sdtdatahash" xmlns:asvg="http://schemas.microsoft.com/office/drawing/2016/SVG/main" r:embed="rId7"/>
                       </a:ext>
                     </a:extLst>
                   </a:blip>
@@ -3344,6 +3710,26 @@
 </file>
 
 <file path=customXml/item1.xml><?xml version="1.0" encoding="utf-8"?>
+<?mso-contentType ?>
+<FormTemplates xmlns="http://schemas.microsoft.com/sharepoint/v3/contenttype/forms">
+  <Display>DocumentLibraryForm</Display>
+  <Edit>DocumentLibraryForm</Edit>
+  <New>DocumentLibraryForm</New>
+</FormTemplates>
+</file>
+
+<file path=customXml/item2.xml><?xml version="1.0" encoding="utf-8"?>
+<p:properties xmlns:p="http://schemas.microsoft.com/office/2006/metadata/properties" xmlns:xsi="http://www.w3.org/2001/XMLSchema-instance" xmlns:pc="http://schemas.microsoft.com/office/infopath/2007/PartnerControls">
+  <documentManagement>
+    <lcf76f155ced4ddcb4097134ff3c332f xmlns="a13eb4cb-3a11-4a77-b1b9-5eaa731867f5">
+      <Terms xmlns="http://schemas.microsoft.com/office/infopath/2007/PartnerControls"/>
+    </lcf76f155ced4ddcb4097134ff3c332f>
+    <TaxCatchAll xmlns="d73eca3a-2879-4d77-b6ae-0c39dac1721e" xsi:nil="true"/>
+  </documentManagement>
+</p:properties>
+</file>
+
+<file path=customXml/item3.xml><?xml version="1.0" encoding="utf-8"?>
 <ct:contentTypeSchema xmlns:ct="http://schemas.microsoft.com/office/2006/metadata/contentType" xmlns:ma="http://schemas.microsoft.com/office/2006/metadata/properties/metaAttributes" ct:_="" ma:_="" ma:contentTypeName="Documento" ma:contentTypeID="0x010100C9EDBE27AC101B42A1EC8F9CE6F09739" ma:contentTypeVersion="15" ma:contentTypeDescription="Crear nuevo documento." ma:contentTypeScope="" ma:versionID="613eb24831361fa1bf829e0e07ae1040">
   <xsd:schema xmlns:xsd="http://www.w3.org/2001/XMLSchema" xmlns:xs="http://www.w3.org/2001/XMLSchema" xmlns:p="http://schemas.microsoft.com/office/2006/metadata/properties" xmlns:ns2="a13eb4cb-3a11-4a77-b1b9-5eaa731867f5" xmlns:ns3="d73eca3a-2879-4d77-b6ae-0c39dac1721e" targetNamespace="http://schemas.microsoft.com/office/2006/metadata/properties" ma:root="true" ma:fieldsID="2411017d579a9df4f752e4544a4516c4" ns2:_="" ns3:_="">
     <xsd:import namespace="a13eb4cb-3a11-4a77-b1b9-5eaa731867f5"/>
@@ -3580,31 +3966,30 @@
 </ct:contentTypeSchema>
 </file>
 
-<file path=customXml/item2.xml><?xml version="1.0" encoding="utf-8"?>
-<p:properties xmlns:p="http://schemas.microsoft.com/office/2006/metadata/properties" xmlns:xsi="http://www.w3.org/2001/XMLSchema-instance" xmlns:pc="http://schemas.microsoft.com/office/infopath/2007/PartnerControls">
-  <documentManagement>
-    <lcf76f155ced4ddcb4097134ff3c332f xmlns="a13eb4cb-3a11-4a77-b1b9-5eaa731867f5">
-      <Terms xmlns="http://schemas.microsoft.com/office/infopath/2007/PartnerControls"/>
-    </lcf76f155ced4ddcb4097134ff3c332f>
-    <TaxCatchAll xmlns="d73eca3a-2879-4d77-b6ae-0c39dac1721e" xsi:nil="true"/>
-  </documentManagement>
-</p:properties>
-</file>
-
-<file path=customXml/item3.xml><?xml version="1.0" encoding="utf-8"?>
-<?mso-contentType ?>
-<FormTemplates xmlns="http://schemas.microsoft.com/sharepoint/v3/contenttype/forms">
-  <Display>DocumentLibraryForm</Display>
-  <Edit>DocumentLibraryForm</Edit>
-  <New>DocumentLibraryForm</New>
-</FormTemplates>
-</file>
-
 <file path=customXml/item4.xml><?xml version="1.0" encoding="utf-8"?>
 <b:Sources xmlns:b="http://schemas.openxmlformats.org/officeDocument/2006/bibliography" xmlns="http://schemas.openxmlformats.org/officeDocument/2006/bibliography" SelectedStyle="\APASixthEditionOfficeOnline.xsl" StyleName="APA" Version="6"/>
 </file>
 
 <file path=customXml/itemProps1.xml><?xml version="1.0" encoding="utf-8"?>
+<ds:datastoreItem xmlns:ds="http://schemas.openxmlformats.org/officeDocument/2006/customXml" ds:itemID="{985A3F48-CCE0-49DF-96D9-496C7929B7C8}">
+  <ds:schemaRefs>
+    <ds:schemaRef ds:uri="http://schemas.microsoft.com/sharepoint/v3/contenttype/forms"/>
+  </ds:schemaRefs>
+</ds:datastoreItem>
+</file>
+
+<file path=customXml/itemProps2.xml><?xml version="1.0" encoding="utf-8"?>
+<ds:datastoreItem xmlns:ds="http://schemas.openxmlformats.org/officeDocument/2006/customXml" ds:itemID="{541E07DA-44E9-4EE1-A622-333A29DAC8D9}">
+  <ds:schemaRefs>
+    <ds:schemaRef ds:uri="http://schemas.microsoft.com/office/2006/metadata/properties"/>
+    <ds:schemaRef ds:uri="http://schemas.microsoft.com/office/infopath/2007/PartnerControls"/>
+    <ds:schemaRef ds:uri="a13eb4cb-3a11-4a77-b1b9-5eaa731867f5"/>
+    <ds:schemaRef ds:uri="d73eca3a-2879-4d77-b6ae-0c39dac1721e"/>
+  </ds:schemaRefs>
+</ds:datastoreItem>
+</file>
+
+<file path=customXml/itemProps3.xml><?xml version="1.0" encoding="utf-8"?>
 <ds:datastoreItem xmlns:ds="http://schemas.openxmlformats.org/officeDocument/2006/customXml" ds:itemID="{EF4A3572-DDA2-4679-A0F5-AF6A6FE309C8}">
   <ds:schemaRefs>
     <ds:schemaRef ds:uri="http://schemas.microsoft.com/office/2006/metadata/contentType"/>
@@ -3623,27 +4008,8 @@
 </ds:datastoreItem>
 </file>
 
-<file path=customXml/itemProps2.xml><?xml version="1.0" encoding="utf-8"?>
-<ds:datastoreItem xmlns:ds="http://schemas.openxmlformats.org/officeDocument/2006/customXml" ds:itemID="{541E07DA-44E9-4EE1-A622-333A29DAC8D9}">
-  <ds:schemaRefs>
-    <ds:schemaRef ds:uri="http://schemas.microsoft.com/office/2006/metadata/properties"/>
-    <ds:schemaRef ds:uri="http://schemas.microsoft.com/office/infopath/2007/PartnerControls"/>
-    <ds:schemaRef ds:uri="a13eb4cb-3a11-4a77-b1b9-5eaa731867f5"/>
-    <ds:schemaRef ds:uri="d73eca3a-2879-4d77-b6ae-0c39dac1721e"/>
-  </ds:schemaRefs>
-</ds:datastoreItem>
-</file>
-
-<file path=customXml/itemProps3.xml><?xml version="1.0" encoding="utf-8"?>
-<ds:datastoreItem xmlns:ds="http://schemas.openxmlformats.org/officeDocument/2006/customXml" ds:itemID="{985A3F48-CCE0-49DF-96D9-496C7929B7C8}">
-  <ds:schemaRefs>
-    <ds:schemaRef ds:uri="http://schemas.microsoft.com/sharepoint/v3/contenttype/forms"/>
-  </ds:schemaRefs>
-</ds:datastoreItem>
-</file>
-
 <file path=customXml/itemProps4.xml><?xml version="1.0" encoding="utf-8"?>
-<ds:datastoreItem xmlns:ds="http://schemas.openxmlformats.org/officeDocument/2006/customXml" ds:itemID="{CCC0D94B-6CBC-40B0-B994-7C969ECEAC0F}">
+<ds:datastoreItem xmlns:ds="http://schemas.openxmlformats.org/officeDocument/2006/customXml" ds:itemID="{CCB71D20-B0A2-440E-BF0F-97C9649F4D9B}">
   <ds:schemaRefs>
     <ds:schemaRef ds:uri="http://schemas.openxmlformats.org/officeDocument/2006/bibliography"/>
   </ds:schemaRefs>

</xml_diff>